<commit_message>
add files and diagrams
</commit_message>
<xml_diff>
--- a/Nafisa Sultana/Algorithm_explanations.docx
+++ b/Nafisa Sultana/Algorithm_explanations.docx
@@ -286,6 +286,7 @@
           <w:szCs w:val="28"/>
         </w:rPr>
       </w:pPr>
+      <w:proofErr w:type="spellStart"/>
       <w:r>
         <w:rPr>
           <w:rFonts w:asciiTheme="majorHAnsi" w:hAnsiTheme="majorHAnsi"/>
@@ -318,7 +319,19 @@
           <w:sz w:val="28"/>
           <w:szCs w:val="28"/>
         </w:rPr>
-        <w:t>ert Pipeline</w:t>
+        <w:t>ert</w:t>
+      </w:r>
+      <w:proofErr w:type="spellEnd"/>
+      <w:r>
+        <w:rPr>
+          <w:rFonts w:asciiTheme="majorHAnsi" w:hAnsiTheme="majorHAnsi"/>
+          <w:b/>
+          <w:bCs/>
+          <w:color w:val="0F4761" w:themeColor="accent1" w:themeShade="BF"/>
+          <w:sz w:val="28"/>
+          <w:szCs w:val="28"/>
+        </w:rPr>
+        <w:t xml:space="preserve"> Pipeline</w:t>
       </w:r>
     </w:p>
     <w:p>
@@ -401,7 +414,31 @@
           <w:sz w:val="28"/>
           <w:szCs w:val="28"/>
         </w:rPr>
-        <w:t>Figure: LogBERT Pipeline for Sequence-Based Anomaly Detection in HDFS Logs</w:t>
+        <w:t xml:space="preserve">Figure: </w:t>
+      </w:r>
+      <w:proofErr w:type="spellStart"/>
+      <w:r>
+        <w:rPr>
+          <w:rFonts w:asciiTheme="majorHAnsi" w:hAnsiTheme="majorHAnsi"/>
+          <w:b/>
+          <w:bCs/>
+          <w:color w:val="0F4761" w:themeColor="accent1" w:themeShade="BF"/>
+          <w:sz w:val="28"/>
+          <w:szCs w:val="28"/>
+        </w:rPr>
+        <w:t>LogBERT</w:t>
+      </w:r>
+      <w:proofErr w:type="spellEnd"/>
+      <w:r>
+        <w:rPr>
+          <w:rFonts w:asciiTheme="majorHAnsi" w:hAnsiTheme="majorHAnsi"/>
+          <w:b/>
+          <w:bCs/>
+          <w:color w:val="0F4761" w:themeColor="accent1" w:themeShade="BF"/>
+          <w:sz w:val="28"/>
+          <w:szCs w:val="28"/>
+        </w:rPr>
+        <w:t xml:space="preserve"> Pipeline for Sequence-Based Anomaly Detection in HDFS Logs</w:t>
       </w:r>
     </w:p>
     <w:p>
@@ -417,7 +454,39 @@
         </w:rPr>
       </w:pPr>
       <w:r>
-        <w:t>This pipeline illustrates the LogBERT-based anomaly detection approach applied to HDFS and cloud-generated logs. The logs are first parsed and cleaned before being transformed into structured event sequences. These sequences are tokenized using a predefined vocabulary and split into training, validation, and test datasets. The LogBERT model then learns patterns in normal log sequences and generates anomaly scores for new data. Based on these scores, logs are classified into risk levels or alerts, and the results are stored and visualized through the Streamlit dashboard for monitoring and analysis.</w:t>
+        <w:t xml:space="preserve">This pipeline illustrates the </w:t>
+      </w:r>
+      <w:proofErr w:type="spellStart"/>
+      <w:r>
+        <w:t>LogBERT</w:t>
+      </w:r>
+      <w:proofErr w:type="spellEnd"/>
+      <w:r>
+        <w:t xml:space="preserve">-based anomaly detection approach applied to HDFS and cloud-generated logs. The logs are first parsed and cleaned before being transformed into structured event sequences. These sequences are tokenized using </w:t>
+      </w:r>
+      <w:proofErr w:type="gramStart"/>
+      <w:r>
+        <w:t>a predefined</w:t>
+      </w:r>
+      <w:proofErr w:type="gramEnd"/>
+      <w:r>
+        <w:t xml:space="preserve"> vocabulary and split into training, validation, and test datasets. The </w:t>
+      </w:r>
+      <w:proofErr w:type="spellStart"/>
+      <w:r>
+        <w:t>LogBERT</w:t>
+      </w:r>
+      <w:proofErr w:type="spellEnd"/>
+      <w:r>
+        <w:t xml:space="preserve"> model then learns patterns in normal log sequences and generates anomaly scores for new data. Based on these scores, logs are classified into risk levels or alerts, and the results are stored and visualized through the </w:t>
+      </w:r>
+      <w:proofErr w:type="spellStart"/>
+      <w:r>
+        <w:t>Streamlit</w:t>
+      </w:r>
+      <w:proofErr w:type="spellEnd"/>
+      <w:r>
+        <w:t xml:space="preserve"> dashboard for monitoring and analysis.</w:t>
       </w:r>
     </w:p>
     <w:p>
@@ -525,16 +594,29 @@
           <w:szCs w:val="28"/>
         </w:rPr>
       </w:pPr>
-      <w:r>
-        <w:rPr>
-          <w:rFonts w:asciiTheme="majorHAnsi" w:hAnsiTheme="majorHAnsi"/>
-          <w:b/>
-          <w:bCs/>
-          <w:color w:val="0F4761" w:themeColor="accent1" w:themeShade="BF"/>
-          <w:sz w:val="28"/>
-          <w:szCs w:val="28"/>
-        </w:rPr>
-        <w:t>Figure : Full AWS-Based Deployment Pipeline for Log Monitoring and Anomaly Detection</w:t>
+      <w:proofErr w:type="gramStart"/>
+      <w:r>
+        <w:rPr>
+          <w:rFonts w:asciiTheme="majorHAnsi" w:hAnsiTheme="majorHAnsi"/>
+          <w:b/>
+          <w:bCs/>
+          <w:color w:val="0F4761" w:themeColor="accent1" w:themeShade="BF"/>
+          <w:sz w:val="28"/>
+          <w:szCs w:val="28"/>
+        </w:rPr>
+        <w:t>Figure :</w:t>
+      </w:r>
+      <w:proofErr w:type="gramEnd"/>
+      <w:r>
+        <w:rPr>
+          <w:rFonts w:asciiTheme="majorHAnsi" w:hAnsiTheme="majorHAnsi"/>
+          <w:b/>
+          <w:bCs/>
+          <w:color w:val="0F4761" w:themeColor="accent1" w:themeShade="BF"/>
+          <w:sz w:val="28"/>
+          <w:szCs w:val="28"/>
+        </w:rPr>
+        <w:t xml:space="preserve"> Full AWS-Based Deployment Pipeline for Log Monitoring and Anomaly Detection</w:t>
       </w:r>
     </w:p>
     <w:p>
@@ -550,7 +632,23 @@
         </w:rPr>
       </w:pPr>
       <w:r>
-        <w:t>This pipeline shows the deployment workflow of the anomaly detection system in an AWS environment. Users interact with the frontend dashboard, which communicates with the backend API hosted on EC2. Logs generated from the Linux system and applications are processed by the LogBERT inference script, which produces anomaly outputs. These outputs are collected through the CloudWatch Agent and sent to CloudWatch Logs for monitoring. CloudWatch Alarm and SNS are used to generate alerts, while the final results are displayed in the dashboard visualization layer.</w:t>
+        <w:t xml:space="preserve">This pipeline shows the deployment workflow of the anomaly detection system in an AWS environment. Users interact with the frontend dashboard, which communicates with the backend API hosted on EC2. Logs generated from the Linux system and applications are processed by the </w:t>
+      </w:r>
+      <w:proofErr w:type="spellStart"/>
+      <w:r>
+        <w:t>LogBERT</w:t>
+      </w:r>
+      <w:proofErr w:type="spellEnd"/>
+      <w:r>
+        <w:t xml:space="preserve"> inference script, which produces anomaly outputs. These outputs are collected through the CloudWatch Agent and sent to CloudWatch Logs for monitoring. CloudWatch Alarm and SNS are used to generate alerts, while the </w:t>
+      </w:r>
+      <w:proofErr w:type="gramStart"/>
+      <w:r>
+        <w:t>final results</w:t>
+      </w:r>
+      <w:proofErr w:type="gramEnd"/>
+      <w:r>
+        <w:t xml:space="preserve"> are displayed in the dashboard visualization layer.</w:t>
       </w:r>
     </w:p>
     <w:p>
@@ -661,7 +759,27 @@
           <w:sz w:val="28"/>
           <w:szCs w:val="28"/>
         </w:rPr>
-        <w:t>Figure 1: Detailed Dataflow Diagram of Log Processing and Anomaly Detection using Python/Colab Environment</w:t>
+        <w:t>Figure 1: Detailed Dataflow Diagram of Log Processing and Anomaly Detection using Python/</w:t>
+      </w:r>
+      <w:proofErr w:type="spellStart"/>
+      <w:r>
+        <w:rPr>
+          <w:rFonts w:asciiTheme="majorHAnsi" w:hAnsiTheme="majorHAnsi"/>
+          <w:color w:val="0F4761" w:themeColor="accent1" w:themeShade="BF"/>
+          <w:sz w:val="28"/>
+          <w:szCs w:val="28"/>
+        </w:rPr>
+        <w:t>Colab</w:t>
+      </w:r>
+      <w:proofErr w:type="spellEnd"/>
+      <w:r>
+        <w:rPr>
+          <w:rFonts w:asciiTheme="majorHAnsi" w:hAnsiTheme="majorHAnsi"/>
+          <w:color w:val="0F4761" w:themeColor="accent1" w:themeShade="BF"/>
+          <w:sz w:val="28"/>
+          <w:szCs w:val="28"/>
+        </w:rPr>
+        <w:t xml:space="preserve"> Environment</w:t>
       </w:r>
     </w:p>
     <w:p>
@@ -669,7 +787,31 @@
         <w:jc w:val="both"/>
       </w:pPr>
       <w:r>
-        <w:t>This diagram illustrates the step-by-step flow of log data through the system. Raw logs from multiple sources are processed using Python/Colab, where parsing, cleaning, feature extraction (TF-IDF), and sequence construction are performed. The processed data is then passed through machine learning models such as Random Forest, Isolation Forest, and the LogBERT model to generate anomaly scores. Finally, the results are classified and visualized in the Streamlit dashboard.</w:t>
+        <w:t>This diagram illustrates the step-by-step flow of log data through the system. Raw logs from multiple sources are processed using Python/</w:t>
+      </w:r>
+      <w:proofErr w:type="spellStart"/>
+      <w:r>
+        <w:t>Colab</w:t>
+      </w:r>
+      <w:proofErr w:type="spellEnd"/>
+      <w:r>
+        <w:t xml:space="preserve">, where parsing, cleaning, feature extraction (TF-IDF), and sequence construction are performed. The processed data is then passed through machine learning models such as Random Forest, Isolation Forest, and the </w:t>
+      </w:r>
+      <w:proofErr w:type="spellStart"/>
+      <w:r>
+        <w:t>LogBERT</w:t>
+      </w:r>
+      <w:proofErr w:type="spellEnd"/>
+      <w:r>
+        <w:t xml:space="preserve"> model to generate anomaly scores. Finally, the results are classified and visualized in the </w:t>
+      </w:r>
+      <w:proofErr w:type="spellStart"/>
+      <w:r>
+        <w:t>Streamlit</w:t>
+      </w:r>
+      <w:proofErr w:type="spellEnd"/>
+      <w:r>
+        <w:t xml:space="preserve"> dashboard.</w:t>
       </w:r>
     </w:p>
     <w:p/>
@@ -793,7 +935,23 @@
         <w:jc w:val="both"/>
       </w:pPr>
       <w:r>
-        <w:t>This diagram presents the overall architecture of the system, divided into four main layers: input, cloud monitoring, processing, and output. The input layer collects logs from various sources, while the monitoring layer uses AWS services such as CloudWatch and SNS for tracking and alerting. The processing layer performs log analysis using Python, LogBERT, and machine learning models. The output layer displays anomaly results and alerts through a Streamlit dashboard.</w:t>
+        <w:t xml:space="preserve">This diagram presents the overall architecture of the system, divided into four main layers: input, cloud monitoring, processing, and output. The input layer collects logs from various sources, while the monitoring layer uses AWS services such as CloudWatch and SNS for tracking and alerting. The processing layer performs log analysis using Python, </w:t>
+      </w:r>
+      <w:proofErr w:type="spellStart"/>
+      <w:r>
+        <w:t>LogBERT</w:t>
+      </w:r>
+      <w:proofErr w:type="spellEnd"/>
+      <w:r>
+        <w:t xml:space="preserve">, and machine learning models. The output layer displays anomaly results and alerts through a </w:t>
+      </w:r>
+      <w:proofErr w:type="spellStart"/>
+      <w:r>
+        <w:t>Streamlit</w:t>
+      </w:r>
+      <w:proofErr w:type="spellEnd"/>
+      <w:r>
+        <w:t xml:space="preserve"> dashboard.</w:t>
       </w:r>
     </w:p>
     <w:p>
@@ -884,7 +1042,23 @@
         <w:jc w:val="both"/>
       </w:pPr>
       <w:r>
-        <w:t>This diagram illustrates the network-level interaction between system components. Users access the Streamlit dashboard through a browser, which communicates with the backend Python logic hosted on an EC2 instance. The backend interacts with AWS CloudWatch for log retrieval and monitoring. The LogBERT model processes the logs and generates anomaly results, which are then sent back to the dashboard for visualization and user interpretation.</w:t>
+        <w:t xml:space="preserve">This diagram illustrates the network-level interaction between system components. Users access the </w:t>
+      </w:r>
+      <w:proofErr w:type="spellStart"/>
+      <w:r>
+        <w:t>Streamlit</w:t>
+      </w:r>
+      <w:proofErr w:type="spellEnd"/>
+      <w:r>
+        <w:t xml:space="preserve"> dashboard through a browser, which communicates with the backend Python logic hosted on an EC2 instance. The backend interacts with AWS CloudWatch for log retrieval and monitoring. The </w:t>
+      </w:r>
+      <w:proofErr w:type="spellStart"/>
+      <w:r>
+        <w:t>LogBERT</w:t>
+      </w:r>
+      <w:proofErr w:type="spellEnd"/>
+      <w:r>
+        <w:t xml:space="preserve"> model processes the logs and generates anomaly results, which are then sent back to the dashboard for visualization and user interpretation.</w:t>
       </w:r>
     </w:p>
     <w:p>
@@ -949,7 +1123,15 @@
         <w:jc w:val="both"/>
       </w:pPr>
       <w:r>
-        <w:t>This diagram provides a simplified view of the system, divided into three main modules: input, processing, and output. The input module collects logs and user requests, the processing module performs data preprocessing and anomaly detection using LogBERT and machine learning models, and the output module presents the results through anomaly scores, alert classification, and a user-friendly dashboard interface.</w:t>
+        <w:t xml:space="preserve">This diagram provides a simplified view of the system, divided into three main modules: input, processing, and output. The input module collects logs and user requests, the processing module performs data preprocessing and anomaly detection using </w:t>
+      </w:r>
+      <w:proofErr w:type="spellStart"/>
+      <w:r>
+        <w:t>LogBERT</w:t>
+      </w:r>
+      <w:proofErr w:type="spellEnd"/>
+      <w:r>
+        <w:t xml:space="preserve"> and machine learning models, and the output module presents the results through anomaly scores, alert classification, and a user-friendly dashboard interface.</w:t>
       </w:r>
     </w:p>
     <w:p>
@@ -1006,7 +1188,15 @@
         <w:jc w:val="both"/>
       </w:pPr>
       <w:r>
-        <w:t>Figure 6: Streamlit-Based Cybersecurity Anomaly Detection Dashboard</w:t>
+        <w:t xml:space="preserve">Figure 6: </w:t>
+      </w:r>
+      <w:proofErr w:type="spellStart"/>
+      <w:r>
+        <w:t>Streamlit</w:t>
+      </w:r>
+      <w:proofErr w:type="spellEnd"/>
+      <w:r>
+        <w:t>-Based Cybersecurity Anomaly Detection Dashboard</w:t>
       </w:r>
     </w:p>
     <w:p>
@@ -1020,7 +1210,21 @@
         <w:rPr>
           <w:lang w:val="en-AU"/>
         </w:rPr>
-        <w:t>The Streamlit dashboard provides a user-friendly interface to visualize anomaly detection results generated by the system. It displays key metrics such as anomaly score, alert level, alert type, and security level to help users quickly understand the system status. The dashboard also presents sample log activities and detected alerts, highlighting suspicious behaviour such as multiple invalid login attempts.</w:t>
+        <w:t xml:space="preserve">The </w:t>
+      </w:r>
+      <w:proofErr w:type="spellStart"/>
+      <w:r>
+        <w:rPr>
+          <w:lang w:val="en-AU"/>
+        </w:rPr>
+        <w:t>Streamlit</w:t>
+      </w:r>
+      <w:proofErr w:type="spellEnd"/>
+      <w:r>
+        <w:rPr>
+          <w:lang w:val="en-AU"/>
+        </w:rPr>
+        <w:t xml:space="preserve"> dashboard provides a user-friendly interface to visualize anomaly detection results generated by the system. It displays key metrics such as anomaly score, alert level, alert type, and security level to help users quickly understand the system status. The dashboard also presents sample log activities and detected alerts, highlighting suspicious behaviour such as multiple invalid login attempts.</w:t>
       </w:r>
     </w:p>
     <w:p>
@@ -1093,7 +1297,29 @@
           <w:szCs w:val="32"/>
         </w:rPr>
         <w:lastRenderedPageBreak/>
-        <w:t>Comparison of Random Forest, Isolation Forest, and LogBERT for HDFS Log Anomaly Detection</w:t>
+        <w:t xml:space="preserve">Comparison of Random Forest, Isolation Forest, and </w:t>
+      </w:r>
+      <w:proofErr w:type="spellStart"/>
+      <w:r>
+        <w:rPr>
+          <w:rFonts w:asciiTheme="majorHAnsi" w:hAnsiTheme="majorHAnsi"/>
+          <w:b/>
+          <w:bCs/>
+          <w:sz w:val="32"/>
+          <w:szCs w:val="32"/>
+        </w:rPr>
+        <w:t>LogBERT</w:t>
+      </w:r>
+      <w:proofErr w:type="spellEnd"/>
+      <w:r>
+        <w:rPr>
+          <w:rFonts w:asciiTheme="majorHAnsi" w:hAnsiTheme="majorHAnsi"/>
+          <w:b/>
+          <w:bCs/>
+          <w:sz w:val="32"/>
+          <w:szCs w:val="32"/>
+        </w:rPr>
+        <w:t xml:space="preserve"> for HDFS Log Anomaly Detection</w:t>
       </w:r>
     </w:p>
     <w:p>
@@ -1173,7 +1399,21 @@
         <w:rPr>
           <w:rFonts w:asciiTheme="majorHAnsi" w:hAnsiTheme="majorHAnsi"/>
         </w:rPr>
-        <w:t xml:space="preserve">The process for this model was fairly simple. First, the event traces were converted into text form so that each block was represented as a sequence of event tokens. After that, </w:t>
+        <w:t xml:space="preserve">The process for this model was </w:t>
+      </w:r>
+      <w:proofErr w:type="gramStart"/>
+      <w:r>
+        <w:rPr>
+          <w:rFonts w:asciiTheme="majorHAnsi" w:hAnsiTheme="majorHAnsi"/>
+        </w:rPr>
+        <w:t>fairly simple</w:t>
+      </w:r>
+      <w:proofErr w:type="gramEnd"/>
+      <w:r>
+        <w:rPr>
+          <w:rFonts w:asciiTheme="majorHAnsi" w:hAnsiTheme="majorHAnsi"/>
+        </w:rPr>
+        <w:t xml:space="preserve">. First, the event traces were converted into text form so that each block was represented as a sequence of event tokens. After that, </w:t>
       </w:r>
       <w:r>
         <w:rPr>
@@ -1187,7 +1427,21 @@
         <w:rPr>
           <w:rFonts w:asciiTheme="majorHAnsi" w:hAnsiTheme="majorHAnsi"/>
         </w:rPr>
-        <w:t xml:space="preserve"> was applied. This step transformed the text into numerical vectors by giving importance to tokens based on how often they appeared in one sample compared to the full dataset. Once these TF-IDF features were created, a </w:t>
+        <w:t xml:space="preserve"> was applied. This step transformed the text into numerical vectors by giving importance to tokens based on how often they </w:t>
+      </w:r>
+      <w:proofErr w:type="gramStart"/>
+      <w:r>
+        <w:rPr>
+          <w:rFonts w:asciiTheme="majorHAnsi" w:hAnsiTheme="majorHAnsi"/>
+        </w:rPr>
+        <w:t>appeared</w:t>
+      </w:r>
+      <w:proofErr w:type="gramEnd"/>
+      <w:r>
+        <w:rPr>
+          <w:rFonts w:asciiTheme="majorHAnsi" w:hAnsiTheme="majorHAnsi"/>
+        </w:rPr>
+        <w:t xml:space="preserve"> in one sample compared to the full dataset. Once these TF-IDF features were created, a </w:t>
       </w:r>
       <w:r>
         <w:rPr>
@@ -1255,7 +1509,21 @@
         <w:rPr>
           <w:rFonts w:asciiTheme="majorHAnsi" w:hAnsiTheme="majorHAnsi"/>
         </w:rPr>
-        <w:t>So overall, Random Forest was a good traditional baseline, but it remained limited by the way the input data was represented.</w:t>
+        <w:t xml:space="preserve">So overall, Random Forest was a good traditional baseline, but it remained limited </w:t>
+      </w:r>
+      <w:proofErr w:type="gramStart"/>
+      <w:r>
+        <w:rPr>
+          <w:rFonts w:asciiTheme="majorHAnsi" w:hAnsiTheme="majorHAnsi"/>
+        </w:rPr>
+        <w:t>by the way the</w:t>
+      </w:r>
+      <w:proofErr w:type="gramEnd"/>
+      <w:r>
+        <w:rPr>
+          <w:rFonts w:asciiTheme="majorHAnsi" w:hAnsiTheme="majorHAnsi"/>
+        </w:rPr>
+        <w:t xml:space="preserve"> input data was represented.</w:t>
       </w:r>
     </w:p>
     <w:p>
@@ -1384,7 +1652,21 @@
         <w:rPr>
           <w:rFonts w:asciiTheme="majorHAnsi" w:hAnsiTheme="majorHAnsi"/>
         </w:rPr>
-        <w:t xml:space="preserve">, using chunk-based reading instead of trying to load the full file at once. Each log entry was cleaned by normalising text, removing unnecessary symbols, and simplifying values like numbers and IP addresses where needed. The cleaned logs were then converted into </w:t>
+        <w:t xml:space="preserve">, using chunk-based reading instead of trying to load the full file at once. Each log entry was cleaned by </w:t>
+      </w:r>
+      <w:proofErr w:type="spellStart"/>
+      <w:r>
+        <w:rPr>
+          <w:rFonts w:asciiTheme="majorHAnsi" w:hAnsiTheme="majorHAnsi"/>
+        </w:rPr>
+        <w:t>normalising</w:t>
+      </w:r>
+      <w:proofErr w:type="spellEnd"/>
+      <w:r>
+        <w:rPr>
+          <w:rFonts w:asciiTheme="majorHAnsi" w:hAnsiTheme="majorHAnsi"/>
+        </w:rPr>
+        <w:t xml:space="preserve"> text, removing unnecessary symbols, and simplifying values like numbers and IP addresses where needed. The cleaned logs were then converted into </w:t>
       </w:r>
       <w:r>
         <w:rPr>
@@ -1439,20 +1721,48 @@
         <w:rPr>
           <w:rFonts w:asciiTheme="majorHAnsi" w:hAnsiTheme="majorHAnsi"/>
         </w:rPr>
-        <w:t>. It does not learn from labels in the same way Random Forest does. Instead, it tries to identify which log samples are isolated or unusual compared to the rest of the data. This makes it more suitable for anomaly detection experiments on large-scale raw logs.</w:t>
-      </w:r>
-    </w:p>
-    <w:p>
-      <w:pPr>
-        <w:rPr>
-          <w:rFonts w:asciiTheme="majorHAnsi" w:hAnsiTheme="majorHAnsi"/>
-        </w:rPr>
-      </w:pPr>
-      <w:r>
-        <w:rPr>
-          <w:rFonts w:asciiTheme="majorHAnsi" w:hAnsiTheme="majorHAnsi"/>
-        </w:rPr>
-        <w:t xml:space="preserve">This is why Isolation Forest is methodologically closer to LogBERT. Both approaches are more naturally used for anomaly detection rather than for standard supervised classification. Even so, </w:t>
+        <w:t xml:space="preserve">. It </w:t>
+      </w:r>
+      <w:proofErr w:type="gramStart"/>
+      <w:r>
+        <w:rPr>
+          <w:rFonts w:asciiTheme="majorHAnsi" w:hAnsiTheme="majorHAnsi"/>
+        </w:rPr>
+        <w:t>does not learn</w:t>
+      </w:r>
+      <w:proofErr w:type="gramEnd"/>
+      <w:r>
+        <w:rPr>
+          <w:rFonts w:asciiTheme="majorHAnsi" w:hAnsiTheme="majorHAnsi"/>
+        </w:rPr>
+        <w:t xml:space="preserve"> from labels in the same way Random Forest does. Instead, it tries to identify which log samples are isolated or unusual compared to the rest of the data. This makes it more suitable for anomaly detection experiments on large-scale raw logs.</w:t>
+      </w:r>
+    </w:p>
+    <w:p>
+      <w:pPr>
+        <w:rPr>
+          <w:rFonts w:asciiTheme="majorHAnsi" w:hAnsiTheme="majorHAnsi"/>
+        </w:rPr>
+      </w:pPr>
+      <w:r>
+        <w:rPr>
+          <w:rFonts w:asciiTheme="majorHAnsi" w:hAnsiTheme="majorHAnsi"/>
+        </w:rPr>
+        <w:t xml:space="preserve">This is why Isolation Forest is methodologically closer to </w:t>
+      </w:r>
+      <w:proofErr w:type="spellStart"/>
+      <w:r>
+        <w:rPr>
+          <w:rFonts w:asciiTheme="majorHAnsi" w:hAnsiTheme="majorHAnsi"/>
+        </w:rPr>
+        <w:t>LogBERT</w:t>
+      </w:r>
+      <w:proofErr w:type="spellEnd"/>
+      <w:r>
+        <w:rPr>
+          <w:rFonts w:asciiTheme="majorHAnsi" w:hAnsiTheme="majorHAnsi"/>
+        </w:rPr>
+        <w:t xml:space="preserve">. Both approaches are more naturally used for anomaly detection rather than for standard supervised classification. Even so, </w:t>
       </w:r>
       <w:r>
         <w:rPr>
@@ -1472,7 +1782,35 @@
         <w:rPr>
           <w:rFonts w:asciiTheme="majorHAnsi" w:hAnsiTheme="majorHAnsi"/>
         </w:rPr>
-        <w:t>So, Isolation Forest was a stronger baseline than Random Forest for comparing with LogBERT, but it still did not fully capture the sequential nature of the HDFS logs.</w:t>
+        <w:t xml:space="preserve">So, Isolation Forest was a stronger baseline than Random Forest for </w:t>
+      </w:r>
+      <w:proofErr w:type="gramStart"/>
+      <w:r>
+        <w:rPr>
+          <w:rFonts w:asciiTheme="majorHAnsi" w:hAnsiTheme="majorHAnsi"/>
+        </w:rPr>
+        <w:t>comparing</w:t>
+      </w:r>
+      <w:proofErr w:type="gramEnd"/>
+      <w:r>
+        <w:rPr>
+          <w:rFonts w:asciiTheme="majorHAnsi" w:hAnsiTheme="majorHAnsi"/>
+        </w:rPr>
+        <w:t xml:space="preserve"> with </w:t>
+      </w:r>
+      <w:proofErr w:type="spellStart"/>
+      <w:r>
+        <w:rPr>
+          <w:rFonts w:asciiTheme="majorHAnsi" w:hAnsiTheme="majorHAnsi"/>
+        </w:rPr>
+        <w:t>LogBERT</w:t>
+      </w:r>
+      <w:proofErr w:type="spellEnd"/>
+      <w:r>
+        <w:rPr>
+          <w:rFonts w:asciiTheme="majorHAnsi" w:hAnsiTheme="majorHAnsi"/>
+        </w:rPr>
+        <w:t>, but it still did not fully capture the sequential nature of the HDFS logs.</w:t>
       </w:r>
     </w:p>
     <w:p>
@@ -1546,20 +1884,44 @@
           <w:b/>
           <w:bCs/>
         </w:rPr>
-        <w:t>3. LogBERT</w:t>
-      </w:r>
-    </w:p>
-    <w:p>
-      <w:pPr>
-        <w:rPr>
-          <w:rFonts w:asciiTheme="majorHAnsi" w:hAnsiTheme="majorHAnsi"/>
-        </w:rPr>
-      </w:pPr>
-      <w:r>
-        <w:rPr>
-          <w:rFonts w:asciiTheme="majorHAnsi" w:hAnsiTheme="majorHAnsi"/>
-        </w:rPr>
-        <w:t xml:space="preserve">For LogBERT, the </w:t>
+        <w:t xml:space="preserve">3. </w:t>
+      </w:r>
+      <w:proofErr w:type="spellStart"/>
+      <w:r>
+        <w:rPr>
+          <w:rFonts w:asciiTheme="majorHAnsi" w:hAnsiTheme="majorHAnsi"/>
+          <w:b/>
+          <w:bCs/>
+        </w:rPr>
+        <w:t>LogBERT</w:t>
+      </w:r>
+      <w:proofErr w:type="spellEnd"/>
+    </w:p>
+    <w:p>
+      <w:pPr>
+        <w:rPr>
+          <w:rFonts w:asciiTheme="majorHAnsi" w:hAnsiTheme="majorHAnsi"/>
+        </w:rPr>
+      </w:pPr>
+      <w:r>
+        <w:rPr>
+          <w:rFonts w:asciiTheme="majorHAnsi" w:hAnsiTheme="majorHAnsi"/>
+        </w:rPr>
+        <w:t xml:space="preserve">For </w:t>
+      </w:r>
+      <w:proofErr w:type="spellStart"/>
+      <w:r>
+        <w:rPr>
+          <w:rFonts w:asciiTheme="majorHAnsi" w:hAnsiTheme="majorHAnsi"/>
+        </w:rPr>
+        <w:t>LogBERT</w:t>
+      </w:r>
+      <w:proofErr w:type="spellEnd"/>
+      <w:r>
+        <w:rPr>
+          <w:rFonts w:asciiTheme="majorHAnsi" w:hAnsiTheme="majorHAnsi"/>
+        </w:rPr>
+        <w:t xml:space="preserve">, the </w:t>
       </w:r>
       <w:r>
         <w:rPr>
@@ -1573,7 +1935,21 @@
         <w:rPr>
           <w:rFonts w:asciiTheme="majorHAnsi" w:hAnsiTheme="majorHAnsi"/>
         </w:rPr>
-        <w:t xml:space="preserve"> was also used, but the processing pipeline was different because the model itself is different. Instead of treating logs as independent text samples, LogBERT required the logs to be converted into </w:t>
+        <w:t xml:space="preserve"> was also used, but the processing pipeline was different because the model itself is different. Instead of treating logs as independent text samples, </w:t>
+      </w:r>
+      <w:proofErr w:type="spellStart"/>
+      <w:r>
+        <w:rPr>
+          <w:rFonts w:asciiTheme="majorHAnsi" w:hAnsiTheme="majorHAnsi"/>
+        </w:rPr>
+        <w:t>LogBERT</w:t>
+      </w:r>
+      <w:proofErr w:type="spellEnd"/>
+      <w:r>
+        <w:rPr>
+          <w:rFonts w:asciiTheme="majorHAnsi" w:hAnsiTheme="majorHAnsi"/>
+        </w:rPr>
+        <w:t xml:space="preserve"> required the logs to be converted into </w:t>
       </w:r>
       <w:r>
         <w:rPr>
@@ -1600,7 +1976,63 @@
         <w:rPr>
           <w:rFonts w:asciiTheme="majorHAnsi" w:hAnsiTheme="majorHAnsi"/>
         </w:rPr>
-        <w:t xml:space="preserve">The HDFS_v2 logs were first grouped into sessions so that each session represented a meaningful block-level event flow. These sessions were then cleaned, tokenised, and encoded into a sequence format suitable for LogBERT. A vocabulary was built from the event tokens, the sequences were padded or trimmed to fit the model input size, and then the data was split into training and testing tensors. LogBERT was trained to learn the normal sequence behaviour of the </w:t>
+        <w:t xml:space="preserve">The HDFS_v2 logs were first grouped into sessions so that each session represented a meaningful block-level event flow. These sessions were then cleaned, </w:t>
+      </w:r>
+      <w:proofErr w:type="spellStart"/>
+      <w:r>
+        <w:rPr>
+          <w:rFonts w:asciiTheme="majorHAnsi" w:hAnsiTheme="majorHAnsi"/>
+        </w:rPr>
+        <w:t>tokenised</w:t>
+      </w:r>
+      <w:proofErr w:type="spellEnd"/>
+      <w:r>
+        <w:rPr>
+          <w:rFonts w:asciiTheme="majorHAnsi" w:hAnsiTheme="majorHAnsi"/>
+        </w:rPr>
+        <w:t xml:space="preserve">, and encoded into a sequence format suitable for </w:t>
+      </w:r>
+      <w:proofErr w:type="spellStart"/>
+      <w:r>
+        <w:rPr>
+          <w:rFonts w:asciiTheme="majorHAnsi" w:hAnsiTheme="majorHAnsi"/>
+        </w:rPr>
+        <w:t>LogBERT</w:t>
+      </w:r>
+      <w:proofErr w:type="spellEnd"/>
+      <w:r>
+        <w:rPr>
+          <w:rFonts w:asciiTheme="majorHAnsi" w:hAnsiTheme="majorHAnsi"/>
+        </w:rPr>
+        <w:t xml:space="preserve">. A vocabulary was built from the event tokens, the sequences were padded or trimmed to fit the model input size, and then the data was split into training and testing tensors. </w:t>
+      </w:r>
+      <w:proofErr w:type="spellStart"/>
+      <w:r>
+        <w:rPr>
+          <w:rFonts w:asciiTheme="majorHAnsi" w:hAnsiTheme="majorHAnsi"/>
+        </w:rPr>
+        <w:t>LogBERT</w:t>
+      </w:r>
+      <w:proofErr w:type="spellEnd"/>
+      <w:r>
+        <w:rPr>
+          <w:rFonts w:asciiTheme="majorHAnsi" w:hAnsiTheme="majorHAnsi"/>
+        </w:rPr>
+        <w:t xml:space="preserve"> was trained to learn the normal sequence </w:t>
+      </w:r>
+      <w:proofErr w:type="spellStart"/>
+      <w:r>
+        <w:rPr>
+          <w:rFonts w:asciiTheme="majorHAnsi" w:hAnsiTheme="majorHAnsi"/>
+        </w:rPr>
+        <w:t>behaviour</w:t>
+      </w:r>
+      <w:proofErr w:type="spellEnd"/>
+      <w:r>
+        <w:rPr>
+          <w:rFonts w:asciiTheme="majorHAnsi" w:hAnsiTheme="majorHAnsi"/>
+        </w:rPr>
+        <w:t xml:space="preserve"> of the </w:t>
       </w:r>
       <w:r>
         <w:rPr>
@@ -1620,7 +2052,21 @@
         <w:rPr>
           <w:rFonts w:asciiTheme="majorHAnsi" w:hAnsiTheme="majorHAnsi"/>
         </w:rPr>
-        <w:t xml:space="preserve">This model is more advanced because it does not simply look at which events appear. It learns </w:t>
+        <w:t xml:space="preserve">This model is more advanced because it does not simply look at which events appear. It </w:t>
+      </w:r>
+      <w:proofErr w:type="gramStart"/>
+      <w:r>
+        <w:rPr>
+          <w:rFonts w:asciiTheme="majorHAnsi" w:hAnsiTheme="majorHAnsi"/>
+        </w:rPr>
+        <w:t>learns</w:t>
+      </w:r>
+      <w:proofErr w:type="gramEnd"/>
+      <w:r>
+        <w:rPr>
+          <w:rFonts w:asciiTheme="majorHAnsi" w:hAnsiTheme="majorHAnsi"/>
+        </w:rPr>
+        <w:t xml:space="preserve"> </w:t>
       </w:r>
       <w:r>
         <w:rPr>
@@ -1647,20 +2093,62 @@
         <w:rPr>
           <w:rFonts w:asciiTheme="majorHAnsi" w:hAnsiTheme="majorHAnsi"/>
         </w:rPr>
-        <w:t>The training results showed that the model learned useful patterns over time, with the training loss decreasing and the anomaly scores showing clear variation between less suspicious and more suspicious sessions. This gave stronger evidence that LogBERT was able to capture more meaningful behaviour from the HDFS_v2 logs than the TF-IDF-based models.</w:t>
-      </w:r>
-    </w:p>
-    <w:p>
-      <w:pPr>
-        <w:rPr>
-          <w:rFonts w:asciiTheme="majorHAnsi" w:hAnsiTheme="majorHAnsi"/>
-        </w:rPr>
-      </w:pPr>
-      <w:r>
-        <w:rPr>
-          <w:rFonts w:asciiTheme="majorHAnsi" w:hAnsiTheme="majorHAnsi"/>
-        </w:rPr>
-        <w:t xml:space="preserve">For that reason, LogBERT was treated as the </w:t>
+        <w:t xml:space="preserve">The training results showed that the model learned useful patterns over time, with the training loss decreasing and the anomaly scores showing clear variation between less suspicious and more suspicious sessions. This gave stronger evidence that </w:t>
+      </w:r>
+      <w:proofErr w:type="spellStart"/>
+      <w:r>
+        <w:rPr>
+          <w:rFonts w:asciiTheme="majorHAnsi" w:hAnsiTheme="majorHAnsi"/>
+        </w:rPr>
+        <w:t>LogBERT</w:t>
+      </w:r>
+      <w:proofErr w:type="spellEnd"/>
+      <w:r>
+        <w:rPr>
+          <w:rFonts w:asciiTheme="majorHAnsi" w:hAnsiTheme="majorHAnsi"/>
+        </w:rPr>
+        <w:t xml:space="preserve"> was able to capture more meaningful </w:t>
+      </w:r>
+      <w:proofErr w:type="spellStart"/>
+      <w:r>
+        <w:rPr>
+          <w:rFonts w:asciiTheme="majorHAnsi" w:hAnsiTheme="majorHAnsi"/>
+        </w:rPr>
+        <w:t>behaviour</w:t>
+      </w:r>
+      <w:proofErr w:type="spellEnd"/>
+      <w:r>
+        <w:rPr>
+          <w:rFonts w:asciiTheme="majorHAnsi" w:hAnsiTheme="majorHAnsi"/>
+        </w:rPr>
+        <w:t xml:space="preserve"> from the HDFS_v2 logs than the TF-IDF-based models.</w:t>
+      </w:r>
+    </w:p>
+    <w:p>
+      <w:pPr>
+        <w:rPr>
+          <w:rFonts w:asciiTheme="majorHAnsi" w:hAnsiTheme="majorHAnsi"/>
+        </w:rPr>
+      </w:pPr>
+      <w:r>
+        <w:rPr>
+          <w:rFonts w:asciiTheme="majorHAnsi" w:hAnsiTheme="majorHAnsi"/>
+        </w:rPr>
+        <w:t xml:space="preserve">For that reason, </w:t>
+      </w:r>
+      <w:proofErr w:type="spellStart"/>
+      <w:r>
+        <w:rPr>
+          <w:rFonts w:asciiTheme="majorHAnsi" w:hAnsiTheme="majorHAnsi"/>
+        </w:rPr>
+        <w:t>LogBERT</w:t>
+      </w:r>
+      <w:proofErr w:type="spellEnd"/>
+      <w:r>
+        <w:rPr>
+          <w:rFonts w:asciiTheme="majorHAnsi" w:hAnsiTheme="majorHAnsi"/>
+        </w:rPr>
+        <w:t xml:space="preserve"> was treated as the </w:t>
       </w:r>
       <w:r>
         <w:rPr>
@@ -1861,11 +2349,19 @@
           <w:rFonts w:asciiTheme="majorHAnsi" w:hAnsiTheme="majorHAnsi"/>
         </w:rPr>
       </w:pPr>
-      <w:r>
-        <w:rPr>
-          <w:rFonts w:asciiTheme="majorHAnsi" w:hAnsiTheme="majorHAnsi"/>
-        </w:rPr>
-        <w:t xml:space="preserve">full-file text processing can take too long to finish </w:t>
+      <w:proofErr w:type="gramStart"/>
+      <w:r>
+        <w:rPr>
+          <w:rFonts w:asciiTheme="majorHAnsi" w:hAnsiTheme="majorHAnsi"/>
+        </w:rPr>
+        <w:t>full</w:t>
+      </w:r>
+      <w:proofErr w:type="gramEnd"/>
+      <w:r>
+        <w:rPr>
+          <w:rFonts w:asciiTheme="majorHAnsi" w:hAnsiTheme="majorHAnsi"/>
+        </w:rPr>
+        <w:t xml:space="preserve">-file text processing can take too long to finish </w:t>
       </w:r>
     </w:p>
     <w:p>
@@ -1878,11 +2374,19 @@
           <w:rFonts w:asciiTheme="majorHAnsi" w:hAnsiTheme="majorHAnsi"/>
         </w:rPr>
       </w:pPr>
-      <w:r>
-        <w:rPr>
-          <w:rFonts w:asciiTheme="majorHAnsi" w:hAnsiTheme="majorHAnsi"/>
-        </w:rPr>
-        <w:t xml:space="preserve">sparse feature generation can still become expensive if the text is not controlled carefully </w:t>
+      <w:proofErr w:type="gramStart"/>
+      <w:r>
+        <w:rPr>
+          <w:rFonts w:asciiTheme="majorHAnsi" w:hAnsiTheme="majorHAnsi"/>
+        </w:rPr>
+        <w:t>sparse</w:t>
+      </w:r>
+      <w:proofErr w:type="gramEnd"/>
+      <w:r>
+        <w:rPr>
+          <w:rFonts w:asciiTheme="majorHAnsi" w:hAnsiTheme="majorHAnsi"/>
+        </w:rPr>
+        <w:t xml:space="preserve"> feature generation can still become expensive if the text is not controlled carefully </w:t>
       </w:r>
     </w:p>
     <w:p>
@@ -1895,11 +2399,19 @@
           <w:rFonts w:asciiTheme="majorHAnsi" w:hAnsiTheme="majorHAnsi"/>
         </w:rPr>
       </w:pPr>
-      <w:r>
-        <w:rPr>
-          <w:rFonts w:asciiTheme="majorHAnsi" w:hAnsiTheme="majorHAnsi"/>
-        </w:rPr>
-        <w:t xml:space="preserve">training anomaly detection models on large text representations can create heavy CPU and memory pressure </w:t>
+      <w:proofErr w:type="gramStart"/>
+      <w:r>
+        <w:rPr>
+          <w:rFonts w:asciiTheme="majorHAnsi" w:hAnsiTheme="majorHAnsi"/>
+        </w:rPr>
+        <w:t>training</w:t>
+      </w:r>
+      <w:proofErr w:type="gramEnd"/>
+      <w:r>
+        <w:rPr>
+          <w:rFonts w:asciiTheme="majorHAnsi" w:hAnsiTheme="majorHAnsi"/>
+        </w:rPr>
+        <w:t xml:space="preserve"> anomaly detection models on large text representations can create heavy CPU and memory pressure </w:t>
       </w:r>
     </w:p>
     <w:p>
@@ -1969,6 +2481,7 @@
         </w:rPr>
         <w:t xml:space="preserve"> and </w:t>
       </w:r>
+      <w:proofErr w:type="spellStart"/>
       <w:r>
         <w:rPr>
           <w:rFonts w:asciiTheme="majorHAnsi" w:hAnsiTheme="majorHAnsi"/>
@@ -1977,6 +2490,7 @@
         </w:rPr>
         <w:t>LogBERT</w:t>
       </w:r>
+      <w:proofErr w:type="spellEnd"/>
       <w:r>
         <w:rPr>
           <w:rFonts w:asciiTheme="majorHAnsi" w:hAnsiTheme="majorHAnsi"/>
@@ -1995,20 +2509,62 @@
         <w:rPr>
           <w:rFonts w:asciiTheme="majorHAnsi" w:hAnsiTheme="majorHAnsi"/>
         </w:rPr>
-        <w:t>, but each model required a different preparation method. Isolation Forest needed efficient text cleaning and vectorisation, while LogBERT needed the logs to be turned into session sequences. Even though the input representation was different, both approaches were still built from the same HDFS_v2 log source, which keeps the comparison more consistent.</w:t>
-      </w:r>
-    </w:p>
-    <w:p>
-      <w:pPr>
-        <w:rPr>
-          <w:rFonts w:asciiTheme="majorHAnsi" w:hAnsiTheme="majorHAnsi"/>
-        </w:rPr>
-      </w:pPr>
-      <w:r>
-        <w:rPr>
-          <w:rFonts w:asciiTheme="majorHAnsi" w:hAnsiTheme="majorHAnsi"/>
-        </w:rPr>
-        <w:t>So, one important part of the project was not only model selection, but also designing a workflow that could handle a very large dataset without breaking the environment. This made memory efficiency and preprocessing design just as important as the models themselves.</w:t>
+        <w:t xml:space="preserve">, but each model required a different preparation method. Isolation Forest needed efficient text cleaning and </w:t>
+      </w:r>
+      <w:proofErr w:type="spellStart"/>
+      <w:r>
+        <w:rPr>
+          <w:rFonts w:asciiTheme="majorHAnsi" w:hAnsiTheme="majorHAnsi"/>
+        </w:rPr>
+        <w:t>vectorisation</w:t>
+      </w:r>
+      <w:proofErr w:type="spellEnd"/>
+      <w:r>
+        <w:rPr>
+          <w:rFonts w:asciiTheme="majorHAnsi" w:hAnsiTheme="majorHAnsi"/>
+        </w:rPr>
+        <w:t xml:space="preserve">, while </w:t>
+      </w:r>
+      <w:proofErr w:type="spellStart"/>
+      <w:r>
+        <w:rPr>
+          <w:rFonts w:asciiTheme="majorHAnsi" w:hAnsiTheme="majorHAnsi"/>
+        </w:rPr>
+        <w:t>LogBERT</w:t>
+      </w:r>
+      <w:proofErr w:type="spellEnd"/>
+      <w:r>
+        <w:rPr>
+          <w:rFonts w:asciiTheme="majorHAnsi" w:hAnsiTheme="majorHAnsi"/>
+        </w:rPr>
+        <w:t xml:space="preserve"> needed the logs to be turned into session sequences. Even though the input representation was different, both approaches were still built from the same HDFS_v2 log source, which keeps the comparison more consistent.</w:t>
+      </w:r>
+    </w:p>
+    <w:p>
+      <w:pPr>
+        <w:rPr>
+          <w:rFonts w:asciiTheme="majorHAnsi" w:hAnsiTheme="majorHAnsi"/>
+        </w:rPr>
+      </w:pPr>
+      <w:r>
+        <w:rPr>
+          <w:rFonts w:asciiTheme="majorHAnsi" w:hAnsiTheme="majorHAnsi"/>
+        </w:rPr>
+        <w:t xml:space="preserve">So, one important part of the project was not only model </w:t>
+      </w:r>
+      <w:proofErr w:type="gramStart"/>
+      <w:r>
+        <w:rPr>
+          <w:rFonts w:asciiTheme="majorHAnsi" w:hAnsiTheme="majorHAnsi"/>
+        </w:rPr>
+        <w:t>selection, but</w:t>
+      </w:r>
+      <w:proofErr w:type="gramEnd"/>
+      <w:r>
+        <w:rPr>
+          <w:rFonts w:asciiTheme="majorHAnsi" w:hAnsiTheme="majorHAnsi"/>
+        </w:rPr>
+        <w:t xml:space="preserve"> also designing a workflow that could handle a very large dataset without breaking the environment. This made memory efficiency and preprocessing design just as important as the models themselves.</w:t>
       </w:r>
     </w:p>
     <w:p>
@@ -2335,7 +2891,21 @@
               <w:rPr>
                 <w:rFonts w:asciiTheme="majorHAnsi" w:hAnsiTheme="majorHAnsi"/>
               </w:rPr>
-              <w:t>Normal: 114,535, Anomaly: 5,465, mean anomaly score 0.4253, max 0.6880</w:t>
+              <w:t xml:space="preserve">Normal: 114,535, Anomaly: 5,465, mean anomaly </w:t>
+            </w:r>
+            <w:proofErr w:type="gramStart"/>
+            <w:r>
+              <w:rPr>
+                <w:rFonts w:asciiTheme="majorHAnsi" w:hAnsiTheme="majorHAnsi"/>
+              </w:rPr>
+              <w:t>score</w:t>
+            </w:r>
+            <w:proofErr w:type="gramEnd"/>
+            <w:r>
+              <w:rPr>
+                <w:rFonts w:asciiTheme="majorHAnsi" w:hAnsiTheme="majorHAnsi"/>
+              </w:rPr>
+              <w:t xml:space="preserve"> 0.4253, max 0.6880</w:t>
             </w:r>
           </w:p>
         </w:tc>
@@ -2356,12 +2926,14 @@
                 <w:rFonts w:asciiTheme="majorHAnsi" w:hAnsiTheme="majorHAnsi"/>
               </w:rPr>
             </w:pPr>
+            <w:proofErr w:type="spellStart"/>
             <w:r>
               <w:rPr>
                 <w:rFonts w:asciiTheme="majorHAnsi" w:hAnsiTheme="majorHAnsi"/>
               </w:rPr>
               <w:t>LogBERT</w:t>
             </w:r>
+            <w:proofErr w:type="spellEnd"/>
           </w:p>
         </w:tc>
         <w:tc>
@@ -2420,7 +2992,35 @@
               <w:rPr>
                 <w:rFonts w:asciiTheme="majorHAnsi" w:hAnsiTheme="majorHAnsi"/>
               </w:rPr>
-              <w:t>Test loss 0.3874, mean anomaly score 0.3009, max anomaly score 15.5338</w:t>
+              <w:t xml:space="preserve">Test loss 0.3874, mean anomaly </w:t>
+            </w:r>
+            <w:proofErr w:type="gramStart"/>
+            <w:r>
+              <w:rPr>
+                <w:rFonts w:asciiTheme="majorHAnsi" w:hAnsiTheme="majorHAnsi"/>
+              </w:rPr>
+              <w:t>score</w:t>
+            </w:r>
+            <w:proofErr w:type="gramEnd"/>
+            <w:r>
+              <w:rPr>
+                <w:rFonts w:asciiTheme="majorHAnsi" w:hAnsiTheme="majorHAnsi"/>
+              </w:rPr>
+              <w:t xml:space="preserve"> 0.3009, max anomaly </w:t>
+            </w:r>
+            <w:proofErr w:type="gramStart"/>
+            <w:r>
+              <w:rPr>
+                <w:rFonts w:asciiTheme="majorHAnsi" w:hAnsiTheme="majorHAnsi"/>
+              </w:rPr>
+              <w:t>score</w:t>
+            </w:r>
+            <w:proofErr w:type="gramEnd"/>
+            <w:r>
+              <w:rPr>
+                <w:rFonts w:asciiTheme="majorHAnsi" w:hAnsiTheme="majorHAnsi"/>
+              </w:rPr>
+              <w:t xml:space="preserve"> 15.5338</w:t>
             </w:r>
           </w:p>
         </w:tc>
@@ -2444,16 +3044,29 @@
           <w:szCs w:val="28"/>
         </w:rPr>
       </w:pPr>
-      <w:r>
-        <w:rPr>
-          <w:rFonts w:asciiTheme="majorHAnsi" w:hAnsiTheme="majorHAnsi"/>
-          <w:b/>
-          <w:bCs/>
-          <w:color w:val="0F4761" w:themeColor="accent1" w:themeShade="BF"/>
-          <w:sz w:val="28"/>
-          <w:szCs w:val="28"/>
-        </w:rPr>
-        <w:t>What the scores mean</w:t>
+      <w:proofErr w:type="gramStart"/>
+      <w:r>
+        <w:rPr>
+          <w:rFonts w:asciiTheme="majorHAnsi" w:hAnsiTheme="majorHAnsi"/>
+          <w:b/>
+          <w:bCs/>
+          <w:color w:val="0F4761" w:themeColor="accent1" w:themeShade="BF"/>
+          <w:sz w:val="28"/>
+          <w:szCs w:val="28"/>
+        </w:rPr>
+        <w:t>What</w:t>
+      </w:r>
+      <w:proofErr w:type="gramEnd"/>
+      <w:r>
+        <w:rPr>
+          <w:rFonts w:asciiTheme="majorHAnsi" w:hAnsiTheme="majorHAnsi"/>
+          <w:b/>
+          <w:bCs/>
+          <w:color w:val="0F4761" w:themeColor="accent1" w:themeShade="BF"/>
+          <w:sz w:val="28"/>
+          <w:szCs w:val="28"/>
+        </w:rPr>
+        <w:t xml:space="preserve"> the scores mean</w:t>
       </w:r>
     </w:p>
     <w:p>
@@ -2513,17 +3126,32 @@
         <w:rPr>
           <w:rFonts w:asciiTheme="majorHAnsi" w:hAnsiTheme="majorHAnsi"/>
         </w:rPr>
-        <w:t>Isolation Forest successfully produced anomaly scores and identified unusual log entries from HDFS_v2. This showed that it could work as an anomaly detector on raw log data. However, many of the top anomalies appeared to be repetitive operational logs rather than clearly abnormal failures. This suggests that the model was reacting more to unusual text patterns than to meaningful log behaviour.</w:t>
-      </w:r>
-    </w:p>
-    <w:p>
-      <w:pPr>
-        <w:rPr>
-          <w:rFonts w:asciiTheme="majorHAnsi" w:hAnsiTheme="majorHAnsi"/>
-          <w:b/>
-          <w:bCs/>
-        </w:rPr>
-      </w:pPr>
+        <w:t xml:space="preserve">Isolation Forest successfully produced anomaly scores and identified unusual log entries from HDFS_v2. This showed that it could work as an anomaly detector on raw log data. However, many of the top anomalies appeared to be repetitive operational logs rather than clearly abnormal failures. This suggests that the model was reacting more to unusual text patterns than to meaningful log </w:t>
+      </w:r>
+      <w:proofErr w:type="spellStart"/>
+      <w:r>
+        <w:rPr>
+          <w:rFonts w:asciiTheme="majorHAnsi" w:hAnsiTheme="majorHAnsi"/>
+        </w:rPr>
+        <w:t>behaviour</w:t>
+      </w:r>
+      <w:proofErr w:type="spellEnd"/>
+      <w:r>
+        <w:rPr>
+          <w:rFonts w:asciiTheme="majorHAnsi" w:hAnsiTheme="majorHAnsi"/>
+        </w:rPr>
+        <w:t>.</w:t>
+      </w:r>
+    </w:p>
+    <w:p>
+      <w:pPr>
+        <w:rPr>
+          <w:rFonts w:asciiTheme="majorHAnsi" w:hAnsiTheme="majorHAnsi"/>
+          <w:b/>
+          <w:bCs/>
+        </w:rPr>
+      </w:pPr>
+      <w:proofErr w:type="spellStart"/>
       <w:r>
         <w:rPr>
           <w:rFonts w:asciiTheme="majorHAnsi" w:hAnsiTheme="majorHAnsi"/>
@@ -2532,18 +3160,41 @@
         </w:rPr>
         <w:t>LogBERT</w:t>
       </w:r>
-    </w:p>
-    <w:p>
-      <w:pPr>
-        <w:rPr>
-          <w:rFonts w:asciiTheme="majorHAnsi" w:hAnsiTheme="majorHAnsi"/>
-        </w:rPr>
-      </w:pPr>
-      <w:r>
-        <w:rPr>
-          <w:rFonts w:asciiTheme="majorHAnsi" w:hAnsiTheme="majorHAnsi"/>
-        </w:rPr>
-        <w:t>LogBERT showed better learning behaviour during training and produced a much wider range of anomaly scores. This wider score separation suggests that it was more effective at distinguishing normal sessions from suspicious ones. The training loss also decreased properly, which gave further support that the model was learning useful sequence patterns.</w:t>
+      <w:proofErr w:type="spellEnd"/>
+    </w:p>
+    <w:p>
+      <w:pPr>
+        <w:rPr>
+          <w:rFonts w:asciiTheme="majorHAnsi" w:hAnsiTheme="majorHAnsi"/>
+        </w:rPr>
+      </w:pPr>
+      <w:proofErr w:type="spellStart"/>
+      <w:r>
+        <w:rPr>
+          <w:rFonts w:asciiTheme="majorHAnsi" w:hAnsiTheme="majorHAnsi"/>
+        </w:rPr>
+        <w:t>LogBERT</w:t>
+      </w:r>
+      <w:proofErr w:type="spellEnd"/>
+      <w:r>
+        <w:rPr>
+          <w:rFonts w:asciiTheme="majorHAnsi" w:hAnsiTheme="majorHAnsi"/>
+        </w:rPr>
+        <w:t xml:space="preserve"> showed better learning </w:t>
+      </w:r>
+      <w:proofErr w:type="spellStart"/>
+      <w:r>
+        <w:rPr>
+          <w:rFonts w:asciiTheme="majorHAnsi" w:hAnsiTheme="majorHAnsi"/>
+        </w:rPr>
+        <w:t>behaviour</w:t>
+      </w:r>
+      <w:proofErr w:type="spellEnd"/>
+      <w:r>
+        <w:rPr>
+          <w:rFonts w:asciiTheme="majorHAnsi" w:hAnsiTheme="majorHAnsi"/>
+        </w:rPr>
+        <w:t xml:space="preserve"> during training and produced a much wider range of anomaly scores. This wider score separation suggests that it was more effective at distinguishing normal sessions from suspicious ones. The training loss also decreased properly, which gave further support that the model was learning useful sequence patterns.</w:t>
       </w:r>
     </w:p>
     <w:p>
@@ -2574,20 +3225,58 @@
           <w:szCs w:val="28"/>
         </w:rPr>
         <w:lastRenderedPageBreak/>
-        <w:t>Why Isolation Forest is closer to LogBERT than Random Forest</w:t>
-      </w:r>
-    </w:p>
-    <w:p>
-      <w:pPr>
-        <w:rPr>
-          <w:rFonts w:asciiTheme="majorHAnsi" w:hAnsiTheme="majorHAnsi"/>
-        </w:rPr>
-      </w:pPr>
-      <w:r>
-        <w:rPr>
-          <w:rFonts w:asciiTheme="majorHAnsi" w:hAnsiTheme="majorHAnsi"/>
-        </w:rPr>
-        <w:t xml:space="preserve">Isolation Forest is closer to LogBERT because both are more naturally used for </w:t>
+        <w:t xml:space="preserve">Why Isolation Forest is closer to </w:t>
+      </w:r>
+      <w:proofErr w:type="spellStart"/>
+      <w:r>
+        <w:rPr>
+          <w:rFonts w:asciiTheme="majorHAnsi" w:hAnsiTheme="majorHAnsi"/>
+          <w:b/>
+          <w:bCs/>
+          <w:color w:val="0F4761" w:themeColor="accent1" w:themeShade="BF"/>
+          <w:sz w:val="28"/>
+          <w:szCs w:val="28"/>
+        </w:rPr>
+        <w:t>LogBERT</w:t>
+      </w:r>
+      <w:proofErr w:type="spellEnd"/>
+      <w:r>
+        <w:rPr>
+          <w:rFonts w:asciiTheme="majorHAnsi" w:hAnsiTheme="majorHAnsi"/>
+          <w:b/>
+          <w:bCs/>
+          <w:color w:val="0F4761" w:themeColor="accent1" w:themeShade="BF"/>
+          <w:sz w:val="28"/>
+          <w:szCs w:val="28"/>
+        </w:rPr>
+        <w:t xml:space="preserve"> than Random Forest</w:t>
+      </w:r>
+    </w:p>
+    <w:p>
+      <w:pPr>
+        <w:rPr>
+          <w:rFonts w:asciiTheme="majorHAnsi" w:hAnsiTheme="majorHAnsi"/>
+        </w:rPr>
+      </w:pPr>
+      <w:r>
+        <w:rPr>
+          <w:rFonts w:asciiTheme="majorHAnsi" w:hAnsiTheme="majorHAnsi"/>
+        </w:rPr>
+        <w:t xml:space="preserve">Isolation Forest is closer to </w:t>
+      </w:r>
+      <w:proofErr w:type="spellStart"/>
+      <w:r>
+        <w:rPr>
+          <w:rFonts w:asciiTheme="majorHAnsi" w:hAnsiTheme="majorHAnsi"/>
+        </w:rPr>
+        <w:t>LogBERT</w:t>
+      </w:r>
+      <w:proofErr w:type="spellEnd"/>
+      <w:r>
+        <w:rPr>
+          <w:rFonts w:asciiTheme="majorHAnsi" w:hAnsiTheme="majorHAnsi"/>
+        </w:rPr>
+        <w:t xml:space="preserve"> because both are more naturally used for </w:t>
       </w:r>
       <w:r>
         <w:rPr>
@@ -2614,7 +3303,35 @@
         <w:rPr>
           <w:rFonts w:asciiTheme="majorHAnsi" w:hAnsiTheme="majorHAnsi"/>
         </w:rPr>
-        <w:t>Random Forest mainly learns from labeled examples and predicts classes based on those labels. Isolation Forest, like LogBERT, is more focused on identifying unusual behaviour from the data itself. This makes it a more appropriate comparison baseline when the main goal is anomaly detection on large HDFS logs.</w:t>
+        <w:t xml:space="preserve">Random Forest mainly learns from labeled examples and predicts classes based on those labels. Isolation Forest, like </w:t>
+      </w:r>
+      <w:proofErr w:type="spellStart"/>
+      <w:r>
+        <w:rPr>
+          <w:rFonts w:asciiTheme="majorHAnsi" w:hAnsiTheme="majorHAnsi"/>
+        </w:rPr>
+        <w:t>LogBERT</w:t>
+      </w:r>
+      <w:proofErr w:type="spellEnd"/>
+      <w:r>
+        <w:rPr>
+          <w:rFonts w:asciiTheme="majorHAnsi" w:hAnsiTheme="majorHAnsi"/>
+        </w:rPr>
+        <w:t xml:space="preserve">, is more focused on identifying unusual </w:t>
+      </w:r>
+      <w:proofErr w:type="spellStart"/>
+      <w:r>
+        <w:rPr>
+          <w:rFonts w:asciiTheme="majorHAnsi" w:hAnsiTheme="majorHAnsi"/>
+        </w:rPr>
+        <w:t>behaviour</w:t>
+      </w:r>
+      <w:proofErr w:type="spellEnd"/>
+      <w:r>
+        <w:rPr>
+          <w:rFonts w:asciiTheme="majorHAnsi" w:hAnsiTheme="majorHAnsi"/>
+        </w:rPr>
+        <w:t xml:space="preserve"> from the data itself. This makes it a more appropriate comparison baseline when the main goal is anomaly detection on large HDFS logs.</w:t>
       </w:r>
     </w:p>
     <w:p>
@@ -2690,6 +3407,7 @@
           <w:rFonts w:asciiTheme="majorHAnsi" w:hAnsiTheme="majorHAnsi"/>
         </w:rPr>
       </w:pPr>
+      <w:proofErr w:type="spellStart"/>
       <w:r>
         <w:rPr>
           <w:rFonts w:asciiTheme="majorHAnsi" w:hAnsiTheme="majorHAnsi"/>
@@ -2698,6 +3416,7 @@
         </w:rPr>
         <w:t>LogBERT</w:t>
       </w:r>
+      <w:proofErr w:type="spellEnd"/>
       <w:r>
         <w:rPr>
           <w:rFonts w:asciiTheme="majorHAnsi" w:hAnsiTheme="majorHAnsi"/>
@@ -2715,50 +3434,96 @@
         <w:rPr>
           <w:rFonts w:asciiTheme="majorHAnsi" w:hAnsiTheme="majorHAnsi"/>
         </w:rPr>
-        <w:t>Because of this, Isolation Forest is the more logical baseline for comparison with LogBERT.</w:t>
-      </w:r>
-    </w:p>
-    <w:p>
-      <w:pPr>
-        <w:rPr>
-          <w:rFonts w:asciiTheme="majorHAnsi" w:hAnsiTheme="majorHAnsi"/>
-        </w:rPr>
-      </w:pPr>
-    </w:p>
-    <w:p>
-      <w:pPr>
-        <w:rPr>
-          <w:rFonts w:asciiTheme="majorHAnsi" w:hAnsiTheme="majorHAnsi"/>
-          <w:b/>
-          <w:bCs/>
-          <w:color w:val="0F4761" w:themeColor="accent1" w:themeShade="BF"/>
-          <w:sz w:val="28"/>
-          <w:szCs w:val="28"/>
-        </w:rPr>
-      </w:pPr>
-      <w:r>
-        <w:rPr>
-          <w:rFonts w:asciiTheme="majorHAnsi" w:hAnsiTheme="majorHAnsi"/>
-          <w:b/>
-          <w:bCs/>
-          <w:color w:val="0F4761" w:themeColor="accent1" w:themeShade="BF"/>
-          <w:sz w:val="28"/>
-          <w:szCs w:val="28"/>
-        </w:rPr>
-        <w:t>Why LogBERT is the best of all three</w:t>
-      </w:r>
-    </w:p>
-    <w:p>
-      <w:pPr>
-        <w:rPr>
-          <w:rFonts w:asciiTheme="majorHAnsi" w:hAnsiTheme="majorHAnsi"/>
-        </w:rPr>
-      </w:pPr>
-      <w:r>
-        <w:rPr>
-          <w:rFonts w:asciiTheme="majorHAnsi" w:hAnsiTheme="majorHAnsi"/>
-        </w:rPr>
-        <w:t>LogBERT is the strongest final choice because it matches the real nature of the problem much better.</w:t>
+        <w:t xml:space="preserve">Because of this, Isolation Forest is the more logical baseline for comparison with </w:t>
+      </w:r>
+      <w:proofErr w:type="spellStart"/>
+      <w:r>
+        <w:rPr>
+          <w:rFonts w:asciiTheme="majorHAnsi" w:hAnsiTheme="majorHAnsi"/>
+        </w:rPr>
+        <w:t>LogBERT</w:t>
+      </w:r>
+      <w:proofErr w:type="spellEnd"/>
+      <w:r>
+        <w:rPr>
+          <w:rFonts w:asciiTheme="majorHAnsi" w:hAnsiTheme="majorHAnsi"/>
+        </w:rPr>
+        <w:t>.</w:t>
+      </w:r>
+    </w:p>
+    <w:p>
+      <w:pPr>
+        <w:rPr>
+          <w:rFonts w:asciiTheme="majorHAnsi" w:hAnsiTheme="majorHAnsi"/>
+        </w:rPr>
+      </w:pPr>
+    </w:p>
+    <w:p>
+      <w:pPr>
+        <w:rPr>
+          <w:rFonts w:asciiTheme="majorHAnsi" w:hAnsiTheme="majorHAnsi"/>
+          <w:b/>
+          <w:bCs/>
+          <w:color w:val="0F4761" w:themeColor="accent1" w:themeShade="BF"/>
+          <w:sz w:val="28"/>
+          <w:szCs w:val="28"/>
+        </w:rPr>
+      </w:pPr>
+      <w:r>
+        <w:rPr>
+          <w:rFonts w:asciiTheme="majorHAnsi" w:hAnsiTheme="majorHAnsi"/>
+          <w:b/>
+          <w:bCs/>
+          <w:color w:val="0F4761" w:themeColor="accent1" w:themeShade="BF"/>
+          <w:sz w:val="28"/>
+          <w:szCs w:val="28"/>
+        </w:rPr>
+        <w:t xml:space="preserve">Why </w:t>
+      </w:r>
+      <w:proofErr w:type="spellStart"/>
+      <w:r>
+        <w:rPr>
+          <w:rFonts w:asciiTheme="majorHAnsi" w:hAnsiTheme="majorHAnsi"/>
+          <w:b/>
+          <w:bCs/>
+          <w:color w:val="0F4761" w:themeColor="accent1" w:themeShade="BF"/>
+          <w:sz w:val="28"/>
+          <w:szCs w:val="28"/>
+        </w:rPr>
+        <w:t>LogBERT</w:t>
+      </w:r>
+      <w:proofErr w:type="spellEnd"/>
+      <w:r>
+        <w:rPr>
+          <w:rFonts w:asciiTheme="majorHAnsi" w:hAnsiTheme="majorHAnsi"/>
+          <w:b/>
+          <w:bCs/>
+          <w:color w:val="0F4761" w:themeColor="accent1" w:themeShade="BF"/>
+          <w:sz w:val="28"/>
+          <w:szCs w:val="28"/>
+        </w:rPr>
+        <w:t xml:space="preserve"> is the best of all three</w:t>
+      </w:r>
+    </w:p>
+    <w:p>
+      <w:pPr>
+        <w:rPr>
+          <w:rFonts w:asciiTheme="majorHAnsi" w:hAnsiTheme="majorHAnsi"/>
+        </w:rPr>
+      </w:pPr>
+      <w:proofErr w:type="spellStart"/>
+      <w:r>
+        <w:rPr>
+          <w:rFonts w:asciiTheme="majorHAnsi" w:hAnsiTheme="majorHAnsi"/>
+        </w:rPr>
+        <w:t>LogBERT</w:t>
+      </w:r>
+      <w:proofErr w:type="spellEnd"/>
+      <w:r>
+        <w:rPr>
+          <w:rFonts w:asciiTheme="majorHAnsi" w:hAnsiTheme="majorHAnsi"/>
+        </w:rPr>
+        <w:t xml:space="preserve"> is the strongest final choice because it matches the real nature of the problem much better.</w:t>
       </w:r>
     </w:p>
     <w:p>
@@ -2808,11 +3573,19 @@
           <w:rFonts w:asciiTheme="majorHAnsi" w:hAnsiTheme="majorHAnsi"/>
         </w:rPr>
       </w:pPr>
-      <w:r>
-        <w:rPr>
-          <w:rFonts w:asciiTheme="majorHAnsi" w:hAnsiTheme="majorHAnsi"/>
-        </w:rPr>
-        <w:t xml:space="preserve">LogBERT is better because it learns directly from the </w:t>
+      <w:proofErr w:type="spellStart"/>
+      <w:r>
+        <w:rPr>
+          <w:rFonts w:asciiTheme="majorHAnsi" w:hAnsiTheme="majorHAnsi"/>
+        </w:rPr>
+        <w:t>LogBERT</w:t>
+      </w:r>
+      <w:proofErr w:type="spellEnd"/>
+      <w:r>
+        <w:rPr>
+          <w:rFonts w:asciiTheme="majorHAnsi" w:hAnsiTheme="majorHAnsi"/>
+        </w:rPr>
+        <w:t xml:space="preserve"> is better because it learns directly from the </w:t>
       </w:r>
       <w:r>
         <w:rPr>
@@ -2826,20 +3599,42 @@
         <w:rPr>
           <w:rFonts w:asciiTheme="majorHAnsi" w:hAnsiTheme="majorHAnsi"/>
         </w:rPr>
-        <w:t>. It can capture how events usually follow one another and recognise when a sequence behaves differently from normal. This is exactly the kind of information that matters in log anomaly detection.</w:t>
-      </w:r>
-    </w:p>
-    <w:p>
-      <w:pPr>
-        <w:rPr>
-          <w:rFonts w:asciiTheme="majorHAnsi" w:hAnsiTheme="majorHAnsi"/>
-        </w:rPr>
-      </w:pPr>
-      <w:r>
-        <w:rPr>
-          <w:rFonts w:asciiTheme="majorHAnsi" w:hAnsiTheme="majorHAnsi"/>
-        </w:rPr>
-        <w:t>So the overall logic is:</w:t>
+        <w:t xml:space="preserve">. It can capture how events usually follow one another and </w:t>
+      </w:r>
+      <w:proofErr w:type="spellStart"/>
+      <w:r>
+        <w:rPr>
+          <w:rFonts w:asciiTheme="majorHAnsi" w:hAnsiTheme="majorHAnsi"/>
+        </w:rPr>
+        <w:t>recognise</w:t>
+      </w:r>
+      <w:proofErr w:type="spellEnd"/>
+      <w:r>
+        <w:rPr>
+          <w:rFonts w:asciiTheme="majorHAnsi" w:hAnsiTheme="majorHAnsi"/>
+        </w:rPr>
+        <w:t xml:space="preserve"> when a sequence behaves differently from normal. This is exactly the kind of information that matters in log anomaly detection.</w:t>
+      </w:r>
+    </w:p>
+    <w:p>
+      <w:pPr>
+        <w:rPr>
+          <w:rFonts w:asciiTheme="majorHAnsi" w:hAnsiTheme="majorHAnsi"/>
+        </w:rPr>
+      </w:pPr>
+      <w:proofErr w:type="gramStart"/>
+      <w:r>
+        <w:rPr>
+          <w:rFonts w:asciiTheme="majorHAnsi" w:hAnsiTheme="majorHAnsi"/>
+        </w:rPr>
+        <w:t>So</w:t>
+      </w:r>
+      <w:proofErr w:type="gramEnd"/>
+      <w:r>
+        <w:rPr>
+          <w:rFonts w:asciiTheme="majorHAnsi" w:hAnsiTheme="majorHAnsi"/>
+        </w:rPr>
+        <w:t xml:space="preserve"> the overall logic is:</w:t>
       </w:r>
     </w:p>
     <w:p>
@@ -2889,7 +3684,21 @@
         <w:rPr>
           <w:rFonts w:asciiTheme="majorHAnsi" w:hAnsiTheme="majorHAnsi"/>
         </w:rPr>
-        <w:t xml:space="preserve"> is a better anomaly-detection baseline because it is closer in setup to LogBERT </w:t>
+        <w:t xml:space="preserve"> is a better anomaly-detection baseline because it is closer in setup to </w:t>
+      </w:r>
+      <w:proofErr w:type="spellStart"/>
+      <w:r>
+        <w:rPr>
+          <w:rFonts w:asciiTheme="majorHAnsi" w:hAnsiTheme="majorHAnsi"/>
+        </w:rPr>
+        <w:t>LogBERT</w:t>
+      </w:r>
+      <w:proofErr w:type="spellEnd"/>
+      <w:r>
+        <w:rPr>
+          <w:rFonts w:asciiTheme="majorHAnsi" w:hAnsiTheme="majorHAnsi"/>
+        </w:rPr>
+        <w:t xml:space="preserve"> </w:t>
       </w:r>
     </w:p>
     <w:p>
@@ -2902,6 +3711,7 @@
           <w:rFonts w:asciiTheme="majorHAnsi" w:hAnsiTheme="majorHAnsi"/>
         </w:rPr>
       </w:pPr>
+      <w:proofErr w:type="spellStart"/>
       <w:r>
         <w:rPr>
           <w:rFonts w:asciiTheme="majorHAnsi" w:hAnsiTheme="majorHAnsi"/>
@@ -2910,6 +3720,7 @@
         </w:rPr>
         <w:t>LogBERT</w:t>
       </w:r>
+      <w:proofErr w:type="spellEnd"/>
       <w:r>
         <w:rPr>
           <w:rFonts w:asciiTheme="majorHAnsi" w:hAnsiTheme="majorHAnsi"/>
@@ -2964,32 +3775,64 @@
         </w:rPr>
         <w:t xml:space="preserve">Among the three models, </w:t>
       </w:r>
-      <w:r>
-        <w:rPr>
-          <w:rFonts w:asciiTheme="majorHAnsi" w:hAnsiTheme="majorHAnsi"/>
-          <w:b/>
-          <w:bCs/>
-        </w:rPr>
-        <w:t>LogBERT is the best overall choice</w:t>
-      </w:r>
-      <w:r>
-        <w:rPr>
-          <w:rFonts w:asciiTheme="majorHAnsi" w:hAnsiTheme="majorHAnsi"/>
-        </w:rPr>
-        <w:t xml:space="preserve"> for the project. Random Forest was useful for showing how a standard supervised model performs on structured HDFS data. Isolation Forest was a better comparison baseline because it is unsupervised and methodologically closer to LogBERT. However, both classical models remained limited by TF-IDF features and could not fully capture the sequence structure of the logs.</w:t>
-      </w:r>
-    </w:p>
-    <w:p>
-      <w:pPr>
-        <w:rPr>
-          <w:rFonts w:asciiTheme="majorHAnsi" w:hAnsiTheme="majorHAnsi"/>
-        </w:rPr>
-      </w:pPr>
-      <w:r>
-        <w:rPr>
-          <w:rFonts w:asciiTheme="majorHAnsi" w:hAnsiTheme="majorHAnsi"/>
-        </w:rPr>
-        <w:t>LogBERT was the strongest model because it was designed for sequence-based anomaly detection, showed stable learning, and produced more meaningful anomaly separation. For that reason, it is the most suitable final model for the HDFS log anomaly detection task.</w:t>
+      <w:proofErr w:type="spellStart"/>
+      <w:r>
+        <w:rPr>
+          <w:rFonts w:asciiTheme="majorHAnsi" w:hAnsiTheme="majorHAnsi"/>
+          <w:b/>
+          <w:bCs/>
+        </w:rPr>
+        <w:t>LogBERT</w:t>
+      </w:r>
+      <w:proofErr w:type="spellEnd"/>
+      <w:r>
+        <w:rPr>
+          <w:rFonts w:asciiTheme="majorHAnsi" w:hAnsiTheme="majorHAnsi"/>
+          <w:b/>
+          <w:bCs/>
+        </w:rPr>
+        <w:t xml:space="preserve"> is the best overall choice</w:t>
+      </w:r>
+      <w:r>
+        <w:rPr>
+          <w:rFonts w:asciiTheme="majorHAnsi" w:hAnsiTheme="majorHAnsi"/>
+        </w:rPr>
+        <w:t xml:space="preserve"> for the project. Random Forest was useful for showing how a standard supervised model performs on structured HDFS data. Isolation Forest was a better comparison baseline because it is unsupervised and methodologically closer to </w:t>
+      </w:r>
+      <w:proofErr w:type="spellStart"/>
+      <w:r>
+        <w:rPr>
+          <w:rFonts w:asciiTheme="majorHAnsi" w:hAnsiTheme="majorHAnsi"/>
+        </w:rPr>
+        <w:t>LogBERT</w:t>
+      </w:r>
+      <w:proofErr w:type="spellEnd"/>
+      <w:r>
+        <w:rPr>
+          <w:rFonts w:asciiTheme="majorHAnsi" w:hAnsiTheme="majorHAnsi"/>
+        </w:rPr>
+        <w:t>. However, both classical models remained limited by TF-IDF features and could not fully capture the sequence structure of the logs.</w:t>
+      </w:r>
+    </w:p>
+    <w:p>
+      <w:pPr>
+        <w:rPr>
+          <w:rFonts w:asciiTheme="majorHAnsi" w:hAnsiTheme="majorHAnsi"/>
+        </w:rPr>
+      </w:pPr>
+      <w:proofErr w:type="spellStart"/>
+      <w:r>
+        <w:rPr>
+          <w:rFonts w:asciiTheme="majorHAnsi" w:hAnsiTheme="majorHAnsi"/>
+        </w:rPr>
+        <w:t>LogBERT</w:t>
+      </w:r>
+      <w:proofErr w:type="spellEnd"/>
+      <w:r>
+        <w:rPr>
+          <w:rFonts w:asciiTheme="majorHAnsi" w:hAnsiTheme="majorHAnsi"/>
+        </w:rPr>
+        <w:t xml:space="preserve"> was the strongest model because it was designed for sequence-based anomaly detection, showed stable learning, and produced more meaningful anomaly separation. For that reason, it is the most suitable final model for the HDFS log anomaly detection task.</w:t>
       </w:r>
     </w:p>
     <w:p>

</xml_diff>